<commit_message>
Calculateur 3D à l'échelle, espace admin, avis et authentification Supabase
- Calculateur : maquette 3D à l'échelle réelle, murs enchaînés à angle droit, cotes et vue du dessus
- Espace admin (/admin) : chiffres clés, utilisateurs (modification, e-mail de réinitialisation),
  projets, modération des avis, gestion des fournisseurs
- Avis clients stockés dans Supabase, publication réservée aux comptes connectés
- Inscription : pseudo, téléphone international, validation nom/prénom/e-mail, conditions générales
- Accueil et pages responsive (320 px), page de nouveau mot de passe
- Back-end : migrations 0003 à 0006, fonctions admin-utilisateurs et supprimer-compte, modèles d'e-mail

Co-Authored-By: Claude Sonnet 5 <noreply@anthropic.com>
</commit_message>
<xml_diff>
--- a/Infos projet BTM/Cahier_des_charges_BTM_DWWM.docx
+++ b/Infos projet BTM/Cahier_des_charges_BTM_DWWM.docx
@@ -3138,11 +3138,1029 @@
       </w:r>
     </w:p>
     <w:p>
+      <w:pPr/>
+      <w:r>
+        <w:t>Les règles de gestion décrivent les contraintes métier que l'application doit respecter. Elles sont formulées à partir des besoins fonctionnels, des besoins non fonctionnels et des contraintes définis dans ce cahier des charges. Elles serviront ensuite de référence pour la conception de la base de données, les traitements du back-end ou du front-end, ainsi que les tests de validation.</w:t>
+      </w:r>
+    </w:p>
+    <w:p>
       <w:pPr>
         <w:pStyle w:val="Titre2"/>
       </w:pPr>
       <w:r>
-        <w:t>9.1 Mur</w:t>
+        <w:t>9.1 Règles de gestion</w:t>
+      </w:r>
+    </w:p>
+    <w:tbl>
+      <w:tblPr>
+        <w:tblStyle w:val="Grilledutableau"/>
+        <w:tblW w:type="auto" w:w="0"/>
+        <w:jc w:val="center"/>
+        <w:tblLook w:firstColumn="1" w:firstRow="1" w:lastColumn="0" w:lastRow="0" w:noHBand="0" w:noVBand="1" w:val="04A0"/>
+      </w:tblPr>
+      <w:tblGrid>
+        <w:gridCol w:w="2436"/>
+        <w:gridCol w:w="2436"/>
+        <w:gridCol w:w="2436"/>
+        <w:gridCol w:w="2436"/>
+      </w:tblGrid>
+      <w:tr>
+        <w:tc>
+          <w:tcPr>
+            <w:tcW w:type="dxa" w:w="936"/>
+            <w:vAlign w:val="center"/>
+          </w:tcPr>
+          <w:p>
+            <w:r>
+              <w:rPr>
+                <w:b/>
+                <w:sz w:val="17"/>
+              </w:rPr>
+              <w:t>Référence</w:t>
+            </w:r>
+          </w:p>
+        </w:tc>
+        <w:tc>
+          <w:tcPr>
+            <w:tcW w:type="dxa" w:w="5328"/>
+            <w:vAlign w:val="center"/>
+          </w:tcPr>
+          <w:p>
+            <w:r>
+              <w:rPr>
+                <w:b/>
+                <w:sz w:val="17"/>
+              </w:rPr>
+              <w:t>Règle de gestion</w:t>
+            </w:r>
+          </w:p>
+        </w:tc>
+        <w:tc>
+          <w:tcPr>
+            <w:tcW w:type="dxa" w:w="1872"/>
+            <w:vAlign w:val="center"/>
+          </w:tcPr>
+          <w:p>
+            <w:r>
+              <w:rPr>
+                <w:b/>
+                <w:sz w:val="17"/>
+              </w:rPr>
+              <w:t>Références du cahier des charges</w:t>
+            </w:r>
+          </w:p>
+        </w:tc>
+        <w:tc>
+          <w:tcPr>
+            <w:tcW w:type="dxa" w:w="3744"/>
+            <w:vAlign w:val="center"/>
+          </w:tcPr>
+          <w:p>
+            <w:r>
+              <w:rPr>
+                <w:b/>
+                <w:sz w:val="17"/>
+              </w:rPr>
+              <w:t>Résultat attendu / contrôle</w:t>
+            </w:r>
+          </w:p>
+        </w:tc>
+      </w:tr>
+      <w:tr>
+        <w:tc>
+          <w:tcPr>
+            <w:tcW w:type="dxa" w:w="936"/>
+            <w:vAlign w:val="center"/>
+          </w:tcPr>
+          <w:p>
+            <w:r>
+              <w:rPr>
+                <w:sz w:val="17"/>
+              </w:rPr>
+              <w:t>RG01</w:t>
+            </w:r>
+          </w:p>
+        </w:tc>
+        <w:tc>
+          <w:tcPr>
+            <w:tcW w:type="dxa" w:w="5328"/>
+            <w:vAlign w:val="center"/>
+          </w:tcPr>
+          <w:p>
+            <w:r>
+              <w:rPr>
+                <w:sz w:val="17"/>
+              </w:rPr>
+              <w:t>Le type de projet sélectionné doit appartenir aux quatre types pris en charge : Mur, Dalle, Fondation ou Terrasse.</w:t>
+            </w:r>
+          </w:p>
+        </w:tc>
+        <w:tc>
+          <w:tcPr>
+            <w:tcW w:type="dxa" w:w="1872"/>
+            <w:vAlign w:val="center"/>
+          </w:tcPr>
+          <w:p>
+            <w:r>
+              <w:rPr>
+                <w:sz w:val="17"/>
+              </w:rPr>
+              <w:t>BF01</w:t>
+            </w:r>
+          </w:p>
+        </w:tc>
+        <w:tc>
+          <w:tcPr>
+            <w:tcW w:type="dxa" w:w="3744"/>
+            <w:vAlign w:val="center"/>
+          </w:tcPr>
+          <w:p>
+            <w:r>
+              <w:rPr>
+                <w:sz w:val="17"/>
+              </w:rPr>
+              <w:t>Tout autre type de projet est refusé ou indisponible dans le calculateur.</w:t>
+            </w:r>
+          </w:p>
+        </w:tc>
+      </w:tr>
+      <w:tr>
+        <w:tc>
+          <w:tcPr>
+            <w:tcW w:type="dxa" w:w="936"/>
+            <w:vAlign w:val="center"/>
+          </w:tcPr>
+          <w:p>
+            <w:r>
+              <w:rPr>
+                <w:sz w:val="17"/>
+              </w:rPr>
+              <w:t>RG02</w:t>
+            </w:r>
+          </w:p>
+        </w:tc>
+        <w:tc>
+          <w:tcPr>
+            <w:tcW w:type="dxa" w:w="5328"/>
+            <w:vAlign w:val="center"/>
+          </w:tcPr>
+          <w:p>
+            <w:r>
+              <w:rPr>
+                <w:sz w:val="17"/>
+              </w:rPr>
+              <w:t>Les dimensions nécessaires au calcul doivent être renseignées avec des valeurs numériques strictement supérieures à 0.</w:t>
+            </w:r>
+          </w:p>
+        </w:tc>
+        <w:tc>
+          <w:tcPr>
+            <w:tcW w:type="dxa" w:w="1872"/>
+            <w:vAlign w:val="center"/>
+          </w:tcPr>
+          <w:p>
+            <w:r>
+              <w:rPr>
+                <w:sz w:val="17"/>
+              </w:rPr>
+              <w:t>BF02, BF05</w:t>
+            </w:r>
+          </w:p>
+        </w:tc>
+        <w:tc>
+          <w:tcPr>
+            <w:tcW w:type="dxa" w:w="3744"/>
+            <w:vAlign w:val="center"/>
+          </w:tcPr>
+          <w:p>
+            <w:r>
+              <w:rPr>
+                <w:sz w:val="17"/>
+              </w:rPr>
+              <w:t>Le calcul ne peut pas être lancé tant qu'une donnée obligatoire est absente ou invalide.</w:t>
+            </w:r>
+          </w:p>
+        </w:tc>
+      </w:tr>
+      <w:tr>
+        <w:tc>
+          <w:tcPr>
+            <w:tcW w:type="dxa" w:w="936"/>
+            <w:vAlign w:val="center"/>
+          </w:tcPr>
+          <w:p>
+            <w:r>
+              <w:rPr>
+                <w:sz w:val="17"/>
+              </w:rPr>
+              <w:t>RG03</w:t>
+            </w:r>
+          </w:p>
+        </w:tc>
+        <w:tc>
+          <w:tcPr>
+            <w:tcW w:type="dxa" w:w="5328"/>
+            <w:vAlign w:val="center"/>
+          </w:tcPr>
+          <w:p>
+            <w:r>
+              <w:rPr>
+                <w:sz w:val="17"/>
+              </w:rPr>
+              <w:t>Pour un mur, la surface totale des ouvertures doit être strictement inférieure à la surface du mur.</w:t>
+            </w:r>
+          </w:p>
+        </w:tc>
+        <w:tc>
+          <w:tcPr>
+            <w:tcW w:type="dxa" w:w="1872"/>
+            <w:vAlign w:val="center"/>
+          </w:tcPr>
+          <w:p>
+            <w:r>
+              <w:rPr>
+                <w:sz w:val="17"/>
+              </w:rPr>
+              <w:t>BF02, BF05</w:t>
+            </w:r>
+          </w:p>
+        </w:tc>
+        <w:tc>
+          <w:tcPr>
+            <w:tcW w:type="dxa" w:w="3744"/>
+            <w:vAlign w:val="center"/>
+          </w:tcPr>
+          <w:p>
+            <w:r>
+              <w:rPr>
+                <w:sz w:val="17"/>
+              </w:rPr>
+              <w:t>Le calcul est refusé si la surface des ouvertures dépasse ou atteint la surface du mur.</w:t>
+            </w:r>
+          </w:p>
+        </w:tc>
+      </w:tr>
+      <w:tr>
+        <w:tc>
+          <w:tcPr>
+            <w:tcW w:type="dxa" w:w="936"/>
+            <w:vAlign w:val="center"/>
+          </w:tcPr>
+          <w:p>
+            <w:r>
+              <w:rPr>
+                <w:sz w:val="17"/>
+              </w:rPr>
+              <w:t>RG04</w:t>
+            </w:r>
+          </w:p>
+        </w:tc>
+        <w:tc>
+          <w:tcPr>
+            <w:tcW w:type="dxa" w:w="5328"/>
+            <w:vAlign w:val="center"/>
+          </w:tcPr>
+          <w:p>
+            <w:r>
+              <w:rPr>
+                <w:sz w:val="17"/>
+              </w:rPr>
+              <w:t>Pour une terrasse, une finition doit être sélectionnée parmi les finitions prévues par l'application : carrelage ou béton lisse.</w:t>
+            </w:r>
+          </w:p>
+        </w:tc>
+        <w:tc>
+          <w:tcPr>
+            <w:tcW w:type="dxa" w:w="1872"/>
+            <w:vAlign w:val="center"/>
+          </w:tcPr>
+          <w:p>
+            <w:r>
+              <w:rPr>
+                <w:sz w:val="17"/>
+              </w:rPr>
+              <w:t>BF03</w:t>
+            </w:r>
+          </w:p>
+        </w:tc>
+        <w:tc>
+          <w:tcPr>
+            <w:tcW w:type="dxa" w:w="3744"/>
+            <w:vAlign w:val="center"/>
+          </w:tcPr>
+          <w:p>
+            <w:r>
+              <w:rPr>
+                <w:sz w:val="17"/>
+              </w:rPr>
+              <w:t>Le calcul d'une terrasse nécessite une finition valide.</w:t>
+            </w:r>
+          </w:p>
+        </w:tc>
+      </w:tr>
+      <w:tr>
+        <w:tc>
+          <w:tcPr>
+            <w:tcW w:type="dxa" w:w="936"/>
+            <w:vAlign w:val="center"/>
+          </w:tcPr>
+          <w:p>
+            <w:r>
+              <w:rPr>
+                <w:sz w:val="17"/>
+              </w:rPr>
+              <w:t>RG05</w:t>
+            </w:r>
+          </w:p>
+        </w:tc>
+        <w:tc>
+          <w:tcPr>
+            <w:tcW w:type="dxa" w:w="5328"/>
+            <w:vAlign w:val="center"/>
+          </w:tcPr>
+          <w:p>
+            <w:r>
+              <w:rPr>
+                <w:sz w:val="17"/>
+              </w:rPr>
+              <w:t>Une estimation n'est générée que lorsque les données nécessaires au type de projet sont valides.</w:t>
+            </w:r>
+          </w:p>
+        </w:tc>
+        <w:tc>
+          <w:tcPr>
+            <w:tcW w:type="dxa" w:w="1872"/>
+            <w:vAlign w:val="center"/>
+          </w:tcPr>
+          <w:p>
+            <w:r>
+              <w:rPr>
+                <w:sz w:val="17"/>
+              </w:rPr>
+              <w:t>BF04, BF05, BF06</w:t>
+            </w:r>
+          </w:p>
+        </w:tc>
+        <w:tc>
+          <w:tcPr>
+            <w:tcW w:type="dxa" w:w="3744"/>
+            <w:vAlign w:val="center"/>
+          </w:tcPr>
+          <w:p>
+            <w:r>
+              <w:rPr>
+                <w:sz w:val="17"/>
+              </w:rPr>
+              <w:t>Les données sont validées avant le calcul et un message d'erreur est affiché en cas d'échec.</w:t>
+            </w:r>
+          </w:p>
+        </w:tc>
+      </w:tr>
+      <w:tr>
+        <w:tc>
+          <w:tcPr>
+            <w:tcW w:type="dxa" w:w="936"/>
+            <w:vAlign w:val="center"/>
+          </w:tcPr>
+          <w:p>
+            <w:r>
+              <w:rPr>
+                <w:sz w:val="17"/>
+              </w:rPr>
+              <w:t>RG06</w:t>
+            </w:r>
+          </w:p>
+        </w:tc>
+        <w:tc>
+          <w:tcPr>
+            <w:tcW w:type="dxa" w:w="5328"/>
+            <w:vAlign w:val="center"/>
+          </w:tcPr>
+          <w:p>
+            <w:r>
+              <w:rPr>
+                <w:sz w:val="17"/>
+              </w:rPr>
+              <w:t>Les quantités de matériaux sont calculées à partir des dimensions du projet selon les formules définies dans le cahier des charges.</w:t>
+            </w:r>
+          </w:p>
+        </w:tc>
+        <w:tc>
+          <w:tcPr>
+            <w:tcW w:type="dxa" w:w="1872"/>
+            <w:vAlign w:val="center"/>
+          </w:tcPr>
+          <w:p>
+            <w:r>
+              <w:rPr>
+                <w:sz w:val="17"/>
+              </w:rPr>
+              <w:t>BF08, BF09</w:t>
+            </w:r>
+          </w:p>
+        </w:tc>
+        <w:tc>
+          <w:tcPr>
+            <w:tcW w:type="dxa" w:w="3744"/>
+            <w:vAlign w:val="center"/>
+          </w:tcPr>
+          <w:p>
+            <w:r>
+              <w:rPr>
+                <w:sz w:val="17"/>
+              </w:rPr>
+              <w:t>Les résultats affichent les matériaux nécessaires et leurs quantités estimées.</w:t>
+            </w:r>
+          </w:p>
+        </w:tc>
+      </w:tr>
+      <w:tr>
+        <w:tc>
+          <w:tcPr>
+            <w:tcW w:type="dxa" w:w="936"/>
+            <w:vAlign w:val="center"/>
+          </w:tcPr>
+          <w:p>
+            <w:r>
+              <w:rPr>
+                <w:sz w:val="17"/>
+              </w:rPr>
+              <w:t>RG07</w:t>
+            </w:r>
+          </w:p>
+        </w:tc>
+        <w:tc>
+          <w:tcPr>
+            <w:tcW w:type="dxa" w:w="5328"/>
+            <w:vAlign w:val="center"/>
+          </w:tcPr>
+          <w:p>
+            <w:r>
+              <w:rPr>
+                <w:sz w:val="17"/>
+              </w:rPr>
+              <w:t>Le coût total indicatif correspond à la somme des coûts des matériaux, de la main-d'œuvre et de la livraison.</w:t>
+            </w:r>
+          </w:p>
+        </w:tc>
+        <w:tc>
+          <w:tcPr>
+            <w:tcW w:type="dxa" w:w="1872"/>
+            <w:vAlign w:val="center"/>
+          </w:tcPr>
+          <w:p>
+            <w:r>
+              <w:rPr>
+                <w:sz w:val="17"/>
+              </w:rPr>
+              <w:t>BF10 à BF14</w:t>
+            </w:r>
+          </w:p>
+        </w:tc>
+        <w:tc>
+          <w:tcPr>
+            <w:tcW w:type="dxa" w:w="3744"/>
+            <w:vAlign w:val="center"/>
+          </w:tcPr>
+          <w:p>
+            <w:r>
+              <w:rPr>
+                <w:sz w:val="17"/>
+              </w:rPr>
+              <w:t>Le résultat présente les sous-totaux et le coût total de l'estimation.</w:t>
+            </w:r>
+          </w:p>
+        </w:tc>
+      </w:tr>
+      <w:tr>
+        <w:tc>
+          <w:tcPr>
+            <w:tcW w:type="dxa" w:w="936"/>
+            <w:vAlign w:val="center"/>
+          </w:tcPr>
+          <w:p>
+            <w:r>
+              <w:rPr>
+                <w:sz w:val="17"/>
+              </w:rPr>
+              <w:t>RG08</w:t>
+            </w:r>
+          </w:p>
+        </w:tc>
+        <w:tc>
+          <w:tcPr>
+            <w:tcW w:type="dxa" w:w="5328"/>
+            <w:vAlign w:val="center"/>
+          </w:tcPr>
+          <w:p>
+            <w:r>
+              <w:rPr>
+                <w:sz w:val="17"/>
+              </w:rPr>
+              <w:t>Un fournisseur sélectionné pour une estimation doit appartenir à l'annuaire des fournisseurs enregistrés dans l'application.</w:t>
+            </w:r>
+          </w:p>
+        </w:tc>
+        <w:tc>
+          <w:tcPr>
+            <w:tcW w:type="dxa" w:w="1872"/>
+            <w:vAlign w:val="center"/>
+          </w:tcPr>
+          <w:p>
+            <w:r>
+              <w:rPr>
+                <w:sz w:val="17"/>
+              </w:rPr>
+              <w:t>BF15, BF16</w:t>
+            </w:r>
+          </w:p>
+        </w:tc>
+        <w:tc>
+          <w:tcPr>
+            <w:tcW w:type="dxa" w:w="3744"/>
+            <w:vAlign w:val="center"/>
+          </w:tcPr>
+          <w:p>
+            <w:r>
+              <w:rPr>
+                <w:sz w:val="17"/>
+              </w:rPr>
+              <w:t>Seuls les fournisseurs présents dans les données de l'application peuvent être associés à une estimation.</w:t>
+            </w:r>
+          </w:p>
+        </w:tc>
+      </w:tr>
+      <w:tr>
+        <w:tc>
+          <w:tcPr>
+            <w:tcW w:type="dxa" w:w="936"/>
+            <w:vAlign w:val="center"/>
+          </w:tcPr>
+          <w:p>
+            <w:r>
+              <w:rPr>
+                <w:sz w:val="17"/>
+              </w:rPr>
+              <w:t>RG09</w:t>
+            </w:r>
+          </w:p>
+        </w:tc>
+        <w:tc>
+          <w:tcPr>
+            <w:tcW w:type="dxa" w:w="5328"/>
+            <w:vAlign w:val="center"/>
+          </w:tcPr>
+          <w:p>
+            <w:r>
+              <w:rPr>
+                <w:sz w:val="17"/>
+              </w:rPr>
+              <w:t>Une estimation sauvegardée doit posséder un nom et être enregistrée après qu'un calcul valide a été obtenu.</w:t>
+            </w:r>
+          </w:p>
+        </w:tc>
+        <w:tc>
+          <w:tcPr>
+            <w:tcW w:type="dxa" w:w="1872"/>
+            <w:vAlign w:val="center"/>
+          </w:tcPr>
+          <w:p>
+            <w:r>
+              <w:rPr>
+                <w:sz w:val="17"/>
+              </w:rPr>
+              <w:t>BF25, BF26</w:t>
+            </w:r>
+          </w:p>
+        </w:tc>
+        <w:tc>
+          <w:tcPr>
+            <w:tcW w:type="dxa" w:w="3744"/>
+            <w:vAlign w:val="center"/>
+          </w:tcPr>
+          <w:p>
+            <w:r>
+              <w:rPr>
+                <w:sz w:val="17"/>
+              </w:rPr>
+              <w:t>Une estimation valide peut être sauvegardée sous le nom fourni par l'utilisateur.</w:t>
+            </w:r>
+          </w:p>
+        </w:tc>
+      </w:tr>
+      <w:tr>
+        <w:tc>
+          <w:tcPr>
+            <w:tcW w:type="dxa" w:w="936"/>
+            <w:vAlign w:val="center"/>
+          </w:tcPr>
+          <w:p>
+            <w:r>
+              <w:rPr>
+                <w:sz w:val="17"/>
+              </w:rPr>
+              <w:t>RG10</w:t>
+            </w:r>
+          </w:p>
+        </w:tc>
+        <w:tc>
+          <w:tcPr>
+            <w:tcW w:type="dxa" w:w="5328"/>
+            <w:vAlign w:val="center"/>
+          </w:tcPr>
+          <w:p>
+            <w:r>
+              <w:rPr>
+                <w:sz w:val="17"/>
+              </w:rPr>
+              <w:t>La duplication d'un projet doit créer une nouvelle estimation indépendante dont les dimensions peuvent être modifiées avant un nouveau calcul.</w:t>
+            </w:r>
+          </w:p>
+        </w:tc>
+        <w:tc>
+          <w:tcPr>
+            <w:tcW w:type="dxa" w:w="1872"/>
+            <w:vAlign w:val="center"/>
+          </w:tcPr>
+          <w:p>
+            <w:r>
+              <w:rPr>
+                <w:sz w:val="17"/>
+              </w:rPr>
+              <w:t>BF29, BF30</w:t>
+            </w:r>
+          </w:p>
+        </w:tc>
+        <w:tc>
+          <w:tcPr>
+            <w:tcW w:type="dxa" w:w="3744"/>
+            <w:vAlign w:val="center"/>
+          </w:tcPr>
+          <w:p>
+            <w:r>
+              <w:rPr>
+                <w:sz w:val="17"/>
+              </w:rPr>
+              <w:t>La modification du projet dupliqué ne doit pas modifier le projet d'origine.</w:t>
+            </w:r>
+          </w:p>
+        </w:tc>
+      </w:tr>
+      <w:tr>
+        <w:tc>
+          <w:tcPr>
+            <w:tcW w:type="dxa" w:w="936"/>
+            <w:vAlign w:val="center"/>
+          </w:tcPr>
+          <w:p>
+            <w:r>
+              <w:rPr>
+                <w:sz w:val="17"/>
+              </w:rPr>
+              <w:t>RG11</w:t>
+            </w:r>
+          </w:p>
+        </w:tc>
+        <w:tc>
+          <w:tcPr>
+            <w:tcW w:type="dxa" w:w="5328"/>
+            <w:vAlign w:val="center"/>
+          </w:tcPr>
+          <w:p>
+            <w:r>
+              <w:rPr>
+                <w:sz w:val="17"/>
+              </w:rPr>
+              <w:t>La suppression d'un projet sauvegardé doit être précédée d'une confirmation de l'utilisateur.</w:t>
+            </w:r>
+          </w:p>
+        </w:tc>
+        <w:tc>
+          <w:tcPr>
+            <w:tcW w:type="dxa" w:w="1872"/>
+            <w:vAlign w:val="center"/>
+          </w:tcPr>
+          <w:p>
+            <w:r>
+              <w:rPr>
+                <w:sz w:val="17"/>
+              </w:rPr>
+              <w:t>BF31</w:t>
+            </w:r>
+          </w:p>
+        </w:tc>
+        <w:tc>
+          <w:tcPr>
+            <w:tcW w:type="dxa" w:w="3744"/>
+            <w:vAlign w:val="center"/>
+          </w:tcPr>
+          <w:p>
+            <w:r>
+              <w:rPr>
+                <w:sz w:val="17"/>
+              </w:rPr>
+              <w:t>Le projet n'est supprimé qu'après confirmation.</w:t>
+            </w:r>
+          </w:p>
+        </w:tc>
+      </w:tr>
+      <w:tr>
+        <w:tc>
+          <w:tcPr>
+            <w:tcW w:type="dxa" w:w="936"/>
+            <w:vAlign w:val="center"/>
+          </w:tcPr>
+          <w:p>
+            <w:r>
+              <w:rPr>
+                <w:sz w:val="17"/>
+              </w:rPr>
+              <w:t>RG12</w:t>
+            </w:r>
+          </w:p>
+        </w:tc>
+        <w:tc>
+          <w:tcPr>
+            <w:tcW w:type="dxa" w:w="5328"/>
+            <w:vAlign w:val="center"/>
+          </w:tcPr>
+          <w:p>
+            <w:r>
+              <w:rPr>
+                <w:sz w:val="17"/>
+              </w:rPr>
+              <w:t>Dans la version actuelle, les projets sauvegardés sont conservés dans le localStorage du navigateur et restent disponibles uniquement sur le même navigateur et le même appareil.</w:t>
+            </w:r>
+          </w:p>
+        </w:tc>
+        <w:tc>
+          <w:tcPr>
+            <w:tcW w:type="dxa" w:w="1872"/>
+            <w:vAlign w:val="center"/>
+          </w:tcPr>
+          <w:p>
+            <w:r>
+              <w:rPr>
+                <w:sz w:val="17"/>
+              </w:rPr>
+              <w:t>BF26 à BF32</w:t>
+            </w:r>
+          </w:p>
+        </w:tc>
+        <w:tc>
+          <w:tcPr>
+            <w:tcW w:type="dxa" w:w="3744"/>
+            <w:vAlign w:val="center"/>
+          </w:tcPr>
+          <w:p>
+            <w:r>
+              <w:rPr>
+                <w:sz w:val="17"/>
+              </w:rPr>
+              <w:t>Aucune synchronisation entre appareils ou sauvegarde cloud n'est effectuée.</w:t>
+            </w:r>
+          </w:p>
+        </w:tc>
+      </w:tr>
+      <w:tr>
+        <w:tc>
+          <w:tcPr>
+            <w:tcW w:type="dxa" w:w="936"/>
+            <w:vAlign w:val="center"/>
+          </w:tcPr>
+          <w:p>
+            <w:r>
+              <w:rPr>
+                <w:sz w:val="17"/>
+              </w:rPr>
+              <w:t>RG13</w:t>
+            </w:r>
+          </w:p>
+        </w:tc>
+        <w:tc>
+          <w:tcPr>
+            <w:tcW w:type="dxa" w:w="5328"/>
+            <w:vAlign w:val="center"/>
+          </w:tcPr>
+          <w:p>
+            <w:r>
+              <w:rPr>
+                <w:sz w:val="17"/>
+              </w:rPr>
+              <w:t>L'export PDF ne peut être réalisé qu'à partir d'une estimation calculée et doit reprendre les informations prévues dans le cahier des charges.</w:t>
+            </w:r>
+          </w:p>
+        </w:tc>
+        <w:tc>
+          <w:tcPr>
+            <w:tcW w:type="dxa" w:w="1872"/>
+            <w:vAlign w:val="center"/>
+          </w:tcPr>
+          <w:p>
+            <w:r>
+              <w:rPr>
+                <w:sz w:val="17"/>
+              </w:rPr>
+              <w:t>BF33 à BF38</w:t>
+            </w:r>
+          </w:p>
+        </w:tc>
+        <w:tc>
+          <w:tcPr>
+            <w:tcW w:type="dxa" w:w="3744"/>
+            <w:vAlign w:val="center"/>
+          </w:tcPr>
+          <w:p>
+            <w:r>
+              <w:rPr>
+                <w:sz w:val="17"/>
+              </w:rPr>
+              <w:t>Le PDF contient les dimensions, matériaux, coûts, main-d'œuvre, total et, le cas échéant, le fournisseur sélectionné.</w:t>
+            </w:r>
+          </w:p>
+        </w:tc>
+      </w:tr>
+      <w:tr>
+        <w:tc>
+          <w:tcPr>
+            <w:tcW w:type="dxa" w:w="936"/>
+            <w:vAlign w:val="center"/>
+          </w:tcPr>
+          <w:p>
+            <w:r>
+              <w:rPr>
+                <w:sz w:val="17"/>
+              </w:rPr>
+              <w:t>RG14</w:t>
+            </w:r>
+          </w:p>
+        </w:tc>
+        <w:tc>
+          <w:tcPr>
+            <w:tcW w:type="dxa" w:w="5328"/>
+            <w:vAlign w:val="center"/>
+          </w:tcPr>
+          <w:p>
+            <w:r>
+              <w:rPr>
+                <w:sz w:val="17"/>
+              </w:rPr>
+              <w:t>Les prix unitaires et quantités utilisés pour les calculs sont des valeurs indicatives et peuvent évoluer.</w:t>
+            </w:r>
+          </w:p>
+        </w:tc>
+        <w:tc>
+          <w:tcPr>
+            <w:tcW w:type="dxa" w:w="1872"/>
+            <w:vAlign w:val="center"/>
+          </w:tcPr>
+          <w:p>
+            <w:r>
+              <w:rPr>
+                <w:sz w:val="17"/>
+              </w:rPr>
+              <w:t>BNF10, C04, C05</w:t>
+            </w:r>
+          </w:p>
+        </w:tc>
+        <w:tc>
+          <w:tcPr>
+            <w:tcW w:type="dxa" w:w="3744"/>
+            <w:vAlign w:val="center"/>
+          </w:tcPr>
+          <w:p>
+            <w:r>
+              <w:rPr>
+                <w:sz w:val="17"/>
+              </w:rPr>
+              <w:t>L'application affiche clairement qu'il ne s'agit pas d'un devis officiel.</w:t>
+            </w:r>
+          </w:p>
+        </w:tc>
+      </w:tr>
+      <w:tr>
+        <w:tc>
+          <w:tcPr>
+            <w:tcW w:type="dxa" w:w="936"/>
+            <w:vAlign w:val="center"/>
+          </w:tcPr>
+          <w:p>
+            <w:r>
+              <w:rPr>
+                <w:sz w:val="17"/>
+              </w:rPr>
+              <w:t>RG15</w:t>
+            </w:r>
+          </w:p>
+        </w:tc>
+        <w:tc>
+          <w:tcPr>
+            <w:tcW w:type="dxa" w:w="5328"/>
+            <w:vAlign w:val="center"/>
+          </w:tcPr>
+          <w:p>
+            <w:r>
+              <w:rPr>
+                <w:sz w:val="17"/>
+              </w:rPr>
+              <w:t>Les informations des fournisseurs et les prix utilisés par l'application doivent pouvoir être mis à jour lorsque les informations disponibles évoluent.</w:t>
+            </w:r>
+          </w:p>
+        </w:tc>
+        <w:tc>
+          <w:tcPr>
+            <w:tcW w:type="dxa" w:w="1872"/>
+            <w:vAlign w:val="center"/>
+          </w:tcPr>
+          <w:p>
+            <w:r>
+              <w:rPr>
+                <w:sz w:val="17"/>
+              </w:rPr>
+              <w:t>C04</w:t>
+            </w:r>
+          </w:p>
+        </w:tc>
+        <w:tc>
+          <w:tcPr>
+            <w:tcW w:type="dxa" w:w="3744"/>
+            <w:vAlign w:val="center"/>
+          </w:tcPr>
+          <w:p>
+            <w:r>
+              <w:rPr>
+                <w:sz w:val="17"/>
+              </w:rPr>
+              <w:t>Les données ne sont pas considérées comme définitives et doivent pouvoir être actualisées.</w:t>
+            </w:r>
+          </w:p>
+        </w:tc>
+      </w:tr>
+      <w:tr>
+        <w:tc>
+          <w:tcPr>
+            <w:tcW w:type="dxa" w:w="936"/>
+            <w:vAlign w:val="center"/>
+          </w:tcPr>
+          <w:p>
+            <w:r>
+              <w:rPr>
+                <w:sz w:val="17"/>
+              </w:rPr>
+              <w:t>RG16</w:t>
+            </w:r>
+          </w:p>
+        </w:tc>
+        <w:tc>
+          <w:tcPr>
+            <w:tcW w:type="dxa" w:w="5328"/>
+            <w:vAlign w:val="center"/>
+          </w:tcPr>
+          <w:p>
+            <w:r>
+              <w:rPr>
+                <w:sz w:val="17"/>
+              </w:rPr>
+              <w:t>La première version ne comporte pas d'authentification fonctionnelle ; les projets sont donc gérés localement dans le navigateur.</w:t>
+            </w:r>
+          </w:p>
+        </w:tc>
+        <w:tc>
+          <w:tcPr>
+            <w:tcW w:type="dxa" w:w="1872"/>
+            <w:vAlign w:val="center"/>
+          </w:tcPr>
+          <w:p>
+            <w:r>
+              <w:rPr>
+                <w:sz w:val="17"/>
+              </w:rPr>
+              <w:t>Périmètre / hors périmètre</w:t>
+            </w:r>
+          </w:p>
+        </w:tc>
+        <w:tc>
+          <w:tcPr>
+            <w:tcW w:type="dxa" w:w="3744"/>
+            <w:vAlign w:val="center"/>
+          </w:tcPr>
+          <w:p>
+            <w:r>
+              <w:rPr>
+                <w:sz w:val="17"/>
+              </w:rPr>
+              <w:t>Les pages de connexion et d'inscription restent des interfaces préparées pour une évolution future.</w:t>
+            </w:r>
+          </w:p>
+        </w:tc>
+      </w:tr>
+    </w:tbl>
+    <w:p>
+      <w:pPr>
+        <w:pStyle w:val="Titre2"/>
+      </w:pPr>
+      <w:r>
+        <w:t>9.2 Mur</w:t>
       </w:r>
     </w:p>
     <w:p>
@@ -3200,7 +4218,7 @@
         <w:pStyle w:val="Titre2"/>
       </w:pPr>
       <w:r>
-        <w:t>9.2 Dalle</w:t>
+        <w:t>9.3 Dalle</w:t>
       </w:r>
     </w:p>
     <w:p>
@@ -3258,7 +4276,7 @@
         <w:pStyle w:val="Titre2"/>
       </w:pPr>
       <w:r>
-        <w:t>9.3 Fondation</w:t>
+        <w:t>9.4 Fondation</w:t>
       </w:r>
     </w:p>
     <w:p>
@@ -3307,7 +4325,7 @@
         <w:pStyle w:val="Titre2"/>
       </w:pPr>
       <w:r>
-        <w:t>9.4 Terrasse</w:t>
+        <w:t>9.5 Terrasse</w:t>
       </w:r>
     </w:p>
     <w:p>

</xml_diff>